<commit_message>
Capítulos com estrutura de tese: enunciado da tese, numeração progressiva na metodologia e sínteses de capítulo
Co-Authored-By: Claude Opus 5.5 <noreply@anthropic.com>
Claude-Session: https://claude.ai/code/session_01HxStpW4pQoDfJdTDYr6zEC
</commit_message>
<xml_diff>
--- a/revisao_fio_condutor/1_INTRODUCAO_corrigido.docx
+++ b/revisao_fio_condutor/1_INTRODUCAO_corrigido.docx
@@ -13,7 +13,14 @@
           <w:rFonts w:ascii="Times New Roman" w:hAnsi="Times New Roman"/>
           <w:sz w:val="24"/>
         </w:rPr>
-        <w:t>1. INTRODUÇÃO</w:t>
+        <w:t>1</w:t>
+      </w:r>
+      <w:r>
+        <w:rPr>
+          <w:rFonts w:ascii="Times New Roman" w:hAnsi="Times New Roman"/>
+          <w:sz w:val="24"/>
+        </w:rPr>
+        <w:t xml:space="preserve"> INTRODUÇÃO</w:t>
       </w:r>
     </w:p>
     <w:p>
@@ -1656,7 +1663,24 @@
           <w:b/>
           <w:sz w:val="24"/>
         </w:rPr>
-        <w:t>1.4 CONTRIBUIÇÃO ESPERADA E DELIMITAÇÕES DA PESQUISA</w:t>
+        <w:t>1.4</w:t>
+      </w:r>
+      <w:r>
+        <w:rPr>
+          <w:rFonts w:ascii="Times New Roman" w:hAnsi="Times New Roman"/>
+          <w:b/>
+          <w:sz w:val="24"/>
+          <w:highlight w:val="yellow"/>
+        </w:rPr>
+        <w:t xml:space="preserve"> TESE,</w:t>
+      </w:r>
+      <w:r>
+        <w:rPr>
+          <w:rFonts w:ascii="Times New Roman" w:hAnsi="Times New Roman"/>
+          <w:b/>
+          <w:sz w:val="24"/>
+        </w:rPr>
+        <w:t xml:space="preserve"> CONTRIBUIÇÃO ESPERADA E DELIMITAÇÕES DA PESQUISA</w:t>
       </w:r>
     </w:p>
     <w:p>
@@ -1830,7 +1854,7 @@
           <w:sz w:val="24"/>
           <w:highlight w:val="yellow"/>
         </w:rPr>
-        <w:t>É desse descompasso que nasce a hipótese desta tese. Sustentamos que, em Pipa, as especificidades do território e as culturas profissionais da escola operam como espaços de ressignificação ou de resistência frente à PNED e às pressões da performatividade. Compreendemos a resistência para além da recusa declarada. Ela pode aparecer em práticas construídas no encontro diário entre a norma e a realidade da escola, como a omissão seletiva do que é inexequível, a tradução da norma para finalidades locais e a fabricação de registros que atendem às exigências formais enquanto protegem a prática possível. Ball (2002) chama de fabricações as versões de uma organização produzidas para serem avaliadas, e a noção nos ajuda a ler esse último movimento sem tomá-lo como fraude individual. O desenho da política, descrito na seção 1.2, ajuda a entender por que esses movimentos podem surgir: a lei institui um direito, transforma esse direito em dever do Estado e distribui entre os entes federados a tarefa de prover os meios, sem mecanismo capaz de garantir sua chegada à escola. Trata-se de uma hipótese, e não de um pressuposto. Se as narrativas mostrarem, sobretudo, acomodação à norma, ou respostas explicadas apenas pela ambiguidade do texto, esse também será um resultado da tese, e os critérios para examiná-la estão no Capítulo 4.</w:t>
+        <w:t>É desse descompasso que nasce a tese que propomos defender: em Pipa, as especificidades do território e as culturas profissionais da escola operam como espaços de ressignificação ou de resistência frente à PNED e às pressões da performatividade, e a distância entre a norma e a sala de aula resulta de um processo político, no qual os profissionais da educação também produzem política, e não de uma falha de execução. Enquanto o campo não for concluído, essa formulação tem o estatuto de hipótese de trabalho, e é como hipótese que a tratamos nos capítulos seguintes. Compreendemos a resistência para além da recusa declarada. Ela pode aparecer em práticas construídas no encontro diário entre a norma e a realidade da escola, como a omissão seletiva do que é inexequível, a tradução da norma para finalidades locais e a fabricação de registros que atendem às exigências formais enquanto protegem a prática possível. Ball (2002) chama de fabricações as versões de uma organização produzidas para serem avaliadas, e a noção nos ajuda a ler esse último movimento sem tomá-lo como fraude individual. O desenho da política, descrito na seção 1.2, ajuda a entender por que esses movimentos podem surgir: a lei institui um direito, transforma esse direito em dever do Estado e distribui entre os entes federados a tarefa de prover os meios, sem mecanismo capaz de garantir sua chegada à escola. Trata-se de uma hipótese, e não de um pressuposto. Se as narrativas mostrarem, sobretudo, acomodação à norma, ou respostas explicadas apenas pela ambiguidade do texto, esse também será um resultado da tese, e os critérios para examiná-la estão no Capítulo 4.</w:t>
       </w:r>
     </w:p>
     <w:p>
@@ -2337,7 +2361,7 @@
           <w:sz w:val="24"/>
           <w:highlight w:val="yellow"/>
         </w:rPr>
-        <w:t>hipótese</w:t>
+        <w:t>tese que propomos defender</w:t>
       </w:r>
       <w:r>
         <w:rPr>

</xml_diff>

<commit_message>
Corrige: a tese não dá continuidade ao mestrado (Introdução e slide 3)
Co-Authored-By: Claude Opus 5.5 <noreply@anthropic.com>
Claude-Session: https://claude.ai/code/session_01HxStpW4pQoDfJdTDYr6zEC
</commit_message>
<xml_diff>
--- a/revisao_fio_condutor/1_INTRODUCAO_corrigido.docx
+++ b/revisao_fio_condutor/1_INTRODUCAO_corrigido.docx
@@ -998,14 +998,29 @@
           <w:sz w:val="24"/>
           <w:highlight w:val="yellow"/>
         </w:rPr>
-        <w:t>neutra</w:t>
-      </w:r>
-      <w:r>
-        <w:rPr>
-          <w:rFonts w:ascii="Times New Roman" w:hAnsi="Times New Roman"/>
-          <w:sz w:val="24"/>
-        </w:rPr>
-        <w:t>. A tese dá continuidade à pesquisa de mestrado, uma pesquisa-ação realizada durante a pandemia com uma turma de 2º ano da mesma escola, e a quase vinte anos de convivência com o território de Pipa, onde a pesquisadora residiu, e com a administração pública municipal, na qual atua como profissional técnica de políticas públicas. Essa trajetória trouxe conhecimento sobre a dinâmica local, sobre os caminhos institucionais pelos quais as políticas chegam às escolas e sobre o modo como a rede nomeia e compreende esses processos. A proximidade faz parte das condições da investigação e exige cuidado para o saber prévio da pesquisadora não se sobrepor ao que o campo</w:t>
+        <w:t>neutra. A tese não</w:t>
+      </w:r>
+      <w:r>
+        <w:rPr>
+          <w:rFonts w:ascii="Times New Roman" w:hAnsi="Times New Roman"/>
+          <w:sz w:val="24"/>
+        </w:rPr>
+        <w:t xml:space="preserve"> dá continuidade à pesquisa de mestrado, uma pesquisa-ação realizada durante a pandemia com uma turma de 2º ano da mesma escola</w:t>
+      </w:r>
+      <w:r>
+        <w:rPr>
+          <w:rFonts w:ascii="Times New Roman" w:hAnsi="Times New Roman"/>
+          <w:sz w:val="24"/>
+          <w:highlight w:val="yellow"/>
+        </w:rPr>
+        <w:t>: tem outro objeto, outra pergunta e outro desenho. Do mestrado, ela guarda a familiaridade com a escola, somada</w:t>
+      </w:r>
+      <w:r>
+        <w:rPr>
+          <w:rFonts w:ascii="Times New Roman" w:hAnsi="Times New Roman"/>
+          <w:sz w:val="24"/>
+        </w:rPr>
+        <w:t xml:space="preserve"> a quase vinte anos de convivência com o território de Pipa, onde a pesquisadora residiu, e com a administração pública municipal, na qual atua como profissional técnica de políticas públicas. Essa trajetória trouxe conhecimento sobre a dinâmica local, sobre os caminhos institucionais pelos quais as políticas chegam às escolas e sobre o modo como a rede nomeia e compreende esses processos. A proximidade faz parte das condições da investigação e exige cuidado para o saber prévio da pesquisadora não se sobrepor ao que o campo</w:t>
       </w:r>
       <w:r>
         <w:rPr>

</xml_diff>

<commit_message>
Capítulos e apresentação alinhados à proposta corrigida (questão aberta, quatro objetivos, tese de partida, técnico da SME)
Co-Authored-By: Claude Opus 5.5 <noreply@anthropic.com>
Claude-Session: https://claude.ai/code/session_01HxStpW4pQoDfJdTDYr6zEC
</commit_message>
<xml_diff>
--- a/revisao_fio_condutor/1_INTRODUCAO_corrigido.docx
+++ b/revisao_fio_condutor/1_INTRODUCAO_corrigido.docx
@@ -725,14 +725,14 @@
           <w:sz w:val="24"/>
           <w:highlight w:val="yellow"/>
         </w:rPr>
-        <w:t>, sustentamos a hipótese de que as especificidades do território e as culturas profissionais da escola funcionam como espaços de ressignificação ou de resistência frente à norma e às pressões por resultados. A hipótese é</w:t>
-      </w:r>
-      <w:r>
-        <w:rPr>
-          <w:rFonts w:ascii="Times New Roman" w:hAnsi="Times New Roman"/>
-          <w:sz w:val="24"/>
-        </w:rPr>
-        <w:t xml:space="preserve"> apresentada na seção 1.4 e </w:t>
+        <w:t>, partimos da compreensão de que a PNED não se realiza na escola por simples aplicação de suas orientações, mas por processos de interpretação, tradução e recontextualização atravessados pelas condições da escola, pelas culturas profissionais e pelo território. Essa tese de partida</w:t>
+      </w:r>
+      <w:r>
+        <w:rPr>
+          <w:rFonts w:ascii="Times New Roman" w:hAnsi="Times New Roman"/>
+          <w:sz w:val="24"/>
+        </w:rPr>
+        <w:t>, apresentada na seção 1.4</w:t>
       </w:r>
       <w:r>
         <w:rPr>
@@ -740,7 +740,7 @@
           <w:sz w:val="24"/>
           <w:highlight w:val="yellow"/>
         </w:rPr>
-        <w:t>será confrontada com as</w:t>
+        <w:t>, não antecipa conclusões e será examinada com as</w:t>
       </w:r>
       <w:r>
         <w:rPr>
@@ -1465,7 +1465,7 @@
           <w:sz w:val="24"/>
           <w:highlight w:val="yellow"/>
         </w:rPr>
-        <w:t>os profissionais da educação encenam, isto é, interpretam e traduzem, a PNED</w:t>
+        <w:t>os profissionais da educação encenam e recontextualizam a Política Nacional de Educação Digital</w:t>
       </w:r>
       <w:r>
         <w:rPr>
@@ -1480,7 +1480,7 @@
           <w:sz w:val="24"/>
           <w:highlight w:val="yellow"/>
         </w:rPr>
-        <w:t xml:space="preserve"> da Escola Municipal Domitila Castelo, em Pipa (RN), e de que maneira as especificidades socioespaciais do território, aliadas às culturas profissionais locais, operam como espaços de ressignificação ou de resistência frente à normativa e às pressões da performatividade</w:t>
+        <w:t xml:space="preserve"> da Escola Municipal Domitila Castelo, em Pipa (RN), e como as condições institucionais, materiais, profissionais e socioespaciais do território atravessam esse processo</w:t>
       </w:r>
       <w:r>
         <w:rPr>
@@ -1515,7 +1515,7 @@
           <w:sz w:val="24"/>
           <w:highlight w:val="yellow"/>
         </w:rPr>
-        <w:t>A questão norteadora desdobra-se no objetivo geral e em três objetivos específicos. Os três tratam do contexto da prática e seguem o caminho da encenação: como a política é lida, como é traduzida nas condições da escola e do território e como os profissionais respondem às pressões que a acompanham.</w:t>
+        <w:t>A questão norteadora desdobra-se no objetivo geral e em quatro objetivos específicos. Os três primeiros acompanham o caminho da encenação, isto é, como a política é lida, como é traduzida nas condições da escola e do território e que formas de atuação os profissionais produzem diante dela; o quarto discute o que essas formas significam para a educação digital das crianças.</w:t>
       </w:r>
     </w:p>
     <w:p>
@@ -1543,7 +1543,7 @@
           <w:sz w:val="24"/>
           <w:highlight w:val="yellow"/>
         </w:rPr>
-        <w:t>Analisar a encenação (interpretação e tradução) da Política Nacional de Educação Digital pelos profissionais da educação no contexto da prática da Escola Municipal Domitila Castelo (Pipa/RN), investigando as dinâmicas de recontextualização e de resistência produzidas no cruzamento entre a normativa, as culturas profissionais da escola e as especificidades socioespaciais do território.</w:t>
+        <w:t>Analisar como os profissionais da educação encenam e recontextualizam a Política Nacional de Educação Digital no contexto da prática da Escola Municipal Domitila Castelo, em Pipa (RN), considerando as relações entre a política, as culturas profissionais, as condições materiais e institucionais da escola e as especificidades socioespaciais do território.</w:t>
       </w:r>
     </w:p>
     <w:p>
@@ -1571,7 +1571,7 @@
           <w:sz w:val="24"/>
           <w:highlight w:val="yellow"/>
         </w:rPr>
-        <w:t>a) Investigar como os diferentes profissionais da educação decodificam os textos da PNED e os discursos sobre cultura digital a partir de suas culturas profissionais;</w:t>
+        <w:t>a) Compreender como os diferentes profissionais da educação interpretam os textos da PNED e os discursos relacionados à educação digital, considerando suas experiências, crenças, valores e formas de organização do trabalho;</w:t>
       </w:r>
     </w:p>
     <w:p>
@@ -1586,7 +1586,7 @@
           <w:sz w:val="24"/>
           <w:highlight w:val="yellow"/>
         </w:rPr>
-        <w:t>b) Mapear as táticas institucionais e pedagógicas mobilizadas para traduzir a PNED em ações cotidianas, considerando a dimensão material da escola e as especificidades socioespaciais do território;</w:t>
+        <w:t>b) Analisar como as condições institucionais e materiais da escola e as especificidades socioespaciais do território atravessam a tradução da PNED em ações, escolhas e práticas cotidianas;</w:t>
       </w:r>
     </w:p>
     <w:p>
@@ -1601,7 +1601,7 @@
           <w:sz w:val="24"/>
           <w:highlight w:val="yellow"/>
         </w:rPr>
-        <w:t>c) Identificar lógicas de performatividade derivadas das exigências da PNED e analisar as estratégias de ressignificação e de resistência adotadas pelos profissionais diante dessas pressões.</w:t>
+        <w:t>c) Identificar as diferentes formas de atuação produzidas pelos profissionais diante da política, incluindo processos de adesão, acomodação, adaptação, omissão, negociação, ressignificação e resistência, sem pressupor previamente a predominância de nenhuma delas;</w:t>
       </w:r>
     </w:p>
     <w:p>
@@ -1614,23 +1614,9 @@
         <w:rPr>
           <w:rFonts w:ascii="Times New Roman" w:hAnsi="Times New Roman"/>
           <w:sz w:val="24"/>
-        </w:rPr>
-        <w:t>Para alcançar esses objetivos, adotamos abordagem qualitativa, de natureza interpretativa, e organizamos a investigação como estudo de caso único. Yin (2001, p. 32) define o estudo de caso como “uma investigação empírica que investiga um fenômeno contemporâneo dentro de seu contexto da vida real, especialmente quando os limites entre o fenômeno e o contexto não estão claramente definidos”. É a situação desta pesquisa, na qual infraestrutura, formação, cultura escolar e desigualdades do território condicionam a política e fazem parte dela ao mesmo tempo. O caso não pretende representar outras escolas; seu propósito é compreender a fundo uma realidade singular. A produção dos dados recorre a quatro instrumentos: a) análise documental das normas da política e dos documentos da rede e da escola; b) questionário aplicado aos participantes; c) entrevista semiestruturada; e d) registro iconográfico das condições materiais e da infraestrutura da escola. Diferentemente do mestrado, esta pesquisa não observa aulas, e as práticas chegam à análise pelas narrativas dos participantes, enquanto as condições materiais chegam pelos documentos e pelos registros iconográficos. O registro iconográfico e a consulta ao acervo histórico já foram realizados e sustentam o Capítulo 6; a análise documental ainda será feita. O questionário e as entrevistas</w:t>
-      </w:r>
-      <w:r>
-        <w:rPr>
-          <w:rFonts w:ascii="Times New Roman" w:hAnsi="Times New Roman"/>
-          <w:sz w:val="24"/>
           <w:highlight w:val="yellow"/>
         </w:rPr>
-        <w:t xml:space="preserve"> serão aplicados em seguida, com instrumentos construídos a partir das dimensões da encenação (Apêndices B e C)</w:t>
-      </w:r>
-      <w:r>
-        <w:rPr>
-          <w:rFonts w:ascii="Times New Roman" w:hAnsi="Times New Roman"/>
-          <w:sz w:val="24"/>
-        </w:rPr>
-        <w:t>.</w:t>
+        <w:t>d) Discutir as implicações das diferentes formas de encenação da política para a educação digital das crianças, especialmente no que se refere às dimensões de provisão, proteção e participação no ambiente digital.</w:t>
       </w:r>
     </w:p>
     <w:p>
@@ -1644,7 +1630,7 @@
           <w:rFonts w:ascii="Times New Roman" w:hAnsi="Times New Roman"/>
           <w:sz w:val="24"/>
         </w:rPr>
-        <w:t xml:space="preserve">Participam </w:t>
+        <w:t>Para alcançar esses objetivos, adotamos abordagem qualitativa, de natureza interpretativa, e organizamos a investigação como estudo de caso único. Yin (2001, p. 32) define o estudo de caso como “uma investigação empírica que investiga um fenômeno contemporâneo dentro de seu contexto da vida real, especialmente quando os limites entre o fenômeno e o contexto não estão claramente definidos”. É a situação desta pesquisa, na qual infraestrutura, formação, cultura escolar e desigualdades do território condicionam a política e fazem parte dela ao mesmo tempo. O caso não pretende representar outras escolas; seu propósito é compreender a fundo uma realidade singular. A produção dos dados recorre a quatro instrumentos: a) análise documental das normas da política e dos documentos da rede e da escola; b) questionário aplicado aos participantes; c) entrevista semiestruturada; e d) registro iconográfico das condições materiais e da infraestrutura da escola. Diferentemente do mestrado, esta pesquisa não observa aulas, e as práticas chegam à análise pelas narrativas dos participantes, enquanto as condições materiais chegam pelos documentos e pelos registros iconográficos. O registro iconográfico e a consulta ao acervo histórico já foram realizados e sustentam o Capítulo 6; a análise documental ainda será feita. O questionário e as entrevistas</w:t>
       </w:r>
       <w:r>
         <w:rPr>
@@ -1652,59 +1638,14 @@
           <w:sz w:val="24"/>
           <w:highlight w:val="yellow"/>
         </w:rPr>
-        <w:t>os profissionais da educação que atuam nos anos iniciais da escola e aceitarem o convite: docentes do 1º ao 5º ano, a coordenação pedagógica, a direção e os demais profissionais que participam do trabalho pedagógico dessas turmas, como os do apoio pedagógico e do atendimento educacional especializado, quando houver [indicar o número de participantes por função]. Os documentos da Secretaria Municipal de Educação entram como fonte da dimensão externa do contexto, mas a Secretaria não integra o grupo de participantes, pois o foco recai sobre quem encena a política dentro da escola</w:t>
-      </w:r>
-      <w:r>
-        <w:rPr>
-          <w:rFonts w:ascii="Times New Roman" w:hAnsi="Times New Roman"/>
-          <w:sz w:val="24"/>
-        </w:rPr>
-        <w:t>. As narrativas serão tratadas pela análise temática reflexiva (BRAUN; CLARKE, 2006, 2019), na qual os temas são construções produzidas no encontro entre os dados, o referencial teórico e a reflexividade de quem analisa</w:t>
-      </w:r>
-      <w:r>
-        <w:rPr>
-          <w:rFonts w:ascii="Times New Roman" w:hAnsi="Times New Roman"/>
-          <w:sz w:val="24"/>
-          <w:highlight w:val="yellow"/>
-        </w:rPr>
-        <w:t>, com as dimensões do contexto e os movimentos de recontextualização descritos por Ball, Maguire e Braun (2016) como pontos de partida da leitura. Nas palavras de Braun e Clarke</w:t>
-      </w:r>
-      <w:r>
-        <w:rPr>
-          <w:rFonts w:ascii="Times New Roman" w:hAnsi="Times New Roman"/>
-          <w:sz w:val="24"/>
-        </w:rPr>
-        <w:t>, “na análise temática reflexiva, a subjetividade não é vista como um viés a ser controlado ou eliminado, mas sim como um recurso analítico central e ativo para a produção de conhecimento” (BRAUN; CLARKE, 2019, p. 594, tradução nossa). A proximidade da pesquisadora com o território, discutida na seção 1.1, entra na análise por esse caminho, como elemento registrado e examinado ao longo do processo.</w:t>
-      </w:r>
-    </w:p>
-    <w:p>
-      <w:pPr>
-        <w:spacing w:line="360" w:lineRule="auto" w:before="240" w:after="240"/>
-      </w:pPr>
-      <w:r>
-        <w:rPr>
-          <w:rFonts w:ascii="Times New Roman" w:hAnsi="Times New Roman"/>
-          <w:b/>
-          <w:sz w:val="24"/>
-        </w:rPr>
-        <w:t>1.4</w:t>
-      </w:r>
-      <w:r>
-        <w:rPr>
-          <w:rFonts w:ascii="Times New Roman" w:hAnsi="Times New Roman"/>
-          <w:b/>
-          <w:sz w:val="24"/>
-          <w:highlight w:val="yellow"/>
-        </w:rPr>
-        <w:t xml:space="preserve"> TESE,</w:t>
-      </w:r>
-      <w:r>
-        <w:rPr>
-          <w:rFonts w:ascii="Times New Roman" w:hAnsi="Times New Roman"/>
-          <w:b/>
-          <w:sz w:val="24"/>
-        </w:rPr>
-        <w:t xml:space="preserve"> CONTRIBUIÇÃO ESPERADA E DELIMITAÇÕES DA PESQUISA</w:t>
+        <w:t xml:space="preserve"> serão aplicados em seguida, com instrumentos construídos a partir das dimensões da encenação (Apêndices B e C)</w:t>
+      </w:r>
+      <w:r>
+        <w:rPr>
+          <w:rFonts w:ascii="Times New Roman" w:hAnsi="Times New Roman"/>
+          <w:sz w:val="24"/>
+        </w:rPr>
+        <w:t>.</w:t>
       </w:r>
     </w:p>
     <w:p>
@@ -1717,9 +1658,68 @@
         <w:rPr>
           <w:rFonts w:ascii="Times New Roman" w:hAnsi="Times New Roman"/>
           <w:sz w:val="24"/>
+        </w:rPr>
+        <w:t xml:space="preserve">Participam </w:t>
+      </w:r>
+      <w:r>
+        <w:rPr>
+          <w:rFonts w:ascii="Times New Roman" w:hAnsi="Times New Roman"/>
+          <w:sz w:val="24"/>
           <w:highlight w:val="yellow"/>
         </w:rPr>
-        <w:t>A contribuição desta tese parte de um limite encontrado nos referenciais mobilizados. Como vimos na seção 1.1, as noções de culturas profissionais e de performatividade foram formuladas, em grande parte, a partir de sistemas escolares em que os meios existiam, ainda que distribuídos de forma desigual. Na escola investigada, a situação é outra. Como registramos na abertura desta introdução e documentamos no Capítulo 6, as salas de 1º e 2º anos não dispõem de dispositivos digitais. A pergunta, nesse caso, muda de lugar: o que os profissionais fazem com uma política quando falta aquilo de que ela depende para acontecer na sala de aula? A escala também é outra, pois, como discutido na justificativa, quem trabalha numa escola pequena convive com as famílias fora dela, e cada decisão tem custo social imediato.</w:t>
+        <w:t>os profissionais da educação que atuam nos anos iniciais da escola e aceitarem o convite: docentes do 1º ao 5º ano, a coordenação pedagógica, a direção e os demais profissionais que participam do trabalho pedagógico dessas turmas, como os do apoio pedagógico e do atendimento educacional especializado, quando houver [indicar o número de participantes por função]. Participa também um técnico da Secretaria Municipal de Educação ligado à condução das ações de educação digital no município. Sua escuta é fonte complementar sobre o contexto externo, isto é, sobre como as orientações nacionais são recebidas e encaminhadas pela gestão municipal antes de chegar à escola, e não constitui um segundo caso: a unidade do estudo continua sendo a encenação da PNED na Escola Municipal Domitila Castelo</w:t>
+      </w:r>
+      <w:r>
+        <w:rPr>
+          <w:rFonts w:ascii="Times New Roman" w:hAnsi="Times New Roman"/>
+          <w:sz w:val="24"/>
+        </w:rPr>
+        <w:t>. As narrativas serão tratadas pela análise temática reflexiva (BRAUN; CLARKE, 2006, 2019), na qual os temas são construções produzidas no encontro entre os dados, o referencial teórico e a reflexividade de quem analisa</w:t>
+      </w:r>
+      <w:r>
+        <w:rPr>
+          <w:rFonts w:ascii="Times New Roman" w:hAnsi="Times New Roman"/>
+          <w:sz w:val="24"/>
+          <w:highlight w:val="yellow"/>
+        </w:rPr>
+        <w:t>, com as dimensões do contexto e os movimentos de recontextualização descritos por Ball, Maguire e Braun (2016) como pontos de partida da leitura. Nas palavras de Braun e Clarke</w:t>
+      </w:r>
+      <w:r>
+        <w:rPr>
+          <w:rFonts w:ascii="Times New Roman" w:hAnsi="Times New Roman"/>
+          <w:sz w:val="24"/>
+        </w:rPr>
+        <w:t>, “na análise temática reflexiva, a subjetividade não é vista como um viés a ser controlado ou eliminado, mas sim como um recurso analítico central e ativo para a produção de conhecimento” (BRAUN; CLARKE, 2019, p. 594, tradução nossa). A proximidade da pesquisadora com o território, discutida na seção 1.1, entra na análise por esse caminho, como elemento registrado e examinado ao longo do processo.</w:t>
+      </w:r>
+    </w:p>
+    <w:p>
+      <w:pPr>
+        <w:spacing w:line="360" w:lineRule="auto" w:before="240" w:after="240"/>
+      </w:pPr>
+      <w:r>
+        <w:rPr>
+          <w:rFonts w:ascii="Times New Roman" w:hAnsi="Times New Roman"/>
+          <w:b/>
+          <w:sz w:val="24"/>
+        </w:rPr>
+        <w:t>1.4</w:t>
+      </w:r>
+      <w:r>
+        <w:rPr>
+          <w:rFonts w:ascii="Times New Roman" w:hAnsi="Times New Roman"/>
+          <w:b/>
+          <w:sz w:val="24"/>
+          <w:highlight w:val="yellow"/>
+        </w:rPr>
+        <w:t xml:space="preserve"> TESE DE PARTIDA,</w:t>
+      </w:r>
+      <w:r>
+        <w:rPr>
+          <w:rFonts w:ascii="Times New Roman" w:hAnsi="Times New Roman"/>
+          <w:b/>
+          <w:sz w:val="24"/>
+        </w:rPr>
+        <w:t xml:space="preserve"> CONTRIBUIÇÃO ESPERADA E DELIMITAÇÕES DA PESQUISA</w:t>
       </w:r>
     </w:p>
     <w:p>
@@ -1732,6 +1732,21 @@
         <w:rPr>
           <w:rFonts w:ascii="Times New Roman" w:hAnsi="Times New Roman"/>
           <w:sz w:val="24"/>
+          <w:highlight w:val="yellow"/>
+        </w:rPr>
+        <w:t>A contribuição desta tese parte de um limite encontrado nos referenciais mobilizados. Como vimos na seção 1.1, as noções de culturas profissionais e de performatividade foram formuladas, em grande parte, a partir de sistemas escolares em que os meios existiam, ainda que distribuídos de forma desigual. Na escola investigada, a situação é outra. Como registramos na abertura desta introdução e documentamos no Capítulo 6, as salas de 1º e 2º anos não dispõem de dispositivos digitais. A pergunta, nesse caso, muda de lugar: o que os profissionais fazem com uma política quando falta aquilo de que ela depende para acontecer na sala de aula? A escala também é outra, pois, como discutido na justificativa, quem trabalha numa escola pequena convive com as famílias fora dela, e cada decisão tem custo social imediato.</w:t>
+      </w:r>
+    </w:p>
+    <w:p>
+      <w:pPr>
+        <w:spacing w:line="360" w:lineRule="auto"/>
+        <w:ind w:firstLine="709"/>
+        <w:jc w:val="both"/>
+      </w:pPr>
+      <w:r>
+        <w:rPr>
+          <w:rFonts w:ascii="Times New Roman" w:hAnsi="Times New Roman"/>
+          <w:sz w:val="24"/>
         </w:rPr>
         <w:t>A ACP também encontra limites. Bowe, Ball e Gold (1992, p. 21, tradução nossa) reconhecem a dimensão material das políticas ao afirmar que elas “são intervenções textuais, mas também carregam consigo restrições e possibilidades materiais”, e retomam Rizvi e Kemmis para descrever como os sujeitos interpretam um programa:</w:t>
       </w:r>
@@ -1878,7 +1893,7 @@
           <w:sz w:val="24"/>
           <w:highlight w:val="yellow"/>
         </w:rPr>
-        <w:t>É desse descompasso que nasce a tese que propomos defender: em Pipa, as especificidades do território e as culturas profissionais da escola operam como espaços de ressignificação ou de resistência frente à PNED e às pressões da performatividade, e a distância entre a norma e a sala de aula resulta de um processo político, no qual os profissionais da educação também produzem política, e não de uma falha de execução. Enquanto o campo não for concluído, essa formulação tem o estatuto de hipótese de trabalho, e é como hipótese que a tratamos nos capítulos seguintes. Compreendemos a resistência para além da recusa declarada. Ela pode aparecer em práticas construídas no encontro diário entre a norma e a realidade da escola, como a omissão seletiva do que é inexequível, a tradução da norma para finalidades locais e a fabricação de registros que atendem às exigências formais enquanto protegem a prática possível. Ball (2002) chama de fabricações as versões de uma organização produzidas para serem avaliadas, e a noção nos ajuda a ler esse último movimento sem tomá-lo como fraude individual. O desenho da política, descrito na seção 1.2, ajuda a entender por que esses movimentos podem surgir: a lei institui um direito, transforma esse direito em dever do Estado e distribui entre os entes federados a tarefa de prover os meios, sem mecanismo capaz de garantir sua chegada à escola. Trata-se de uma hipótese, e não de um pressuposto. Se as narrativas mostrarem, sobretudo, acomodação à norma, ou respostas explicadas apenas pela ambiguidade do texto, esse também será um resultado da tese, e os critérios para examiná-la estão no Capítulo 4.</w:t>
+        <w:t>É desse descompasso que nasce a tese de partida desta pesquisa: a PNED não se realiza na escola por simples aplicação de suas orientações. Sua presença no cotidiano resulta de processos de interpretação, tradução e recontextualização atravessados pelas condições materiais e institucionais da escola, pelas culturas profissionais e pelas especificidades do território (BOWE; BALL; GOLD, 1992; MAINARDES, 2006; BALL; MAGUIRE; BRAUN, 2016). Essa compreensão não é uma conclusão antecipada. Diante da política, os profissionais podem aderir, acomodar-se, adaptar, omitir, negociar, ressignificar ou resistir, e podem ainda produzir formas que não previmos. Não pressupomos que alguma delas predomine. Interessa compreender como essas formas se constituem, em que condições aparecem e o que produzem no cotidiano escolar. Algumas têm nome na literatura e nos ajudarão a ler o material quando os dados as sustentarem: a omissão seletiva do que é inexequível, a tradução da norma para finalidades locais e a fabricação de registros que atendem às exigências formais, que Ball (2002) descreve como versões de uma organização produzidas para serem avaliadas. O desenho da política, descrito na seção 1.2, ajuda a entender por que esses movimentos podem surgir, pois a lei institui um direito, transforma esse direito em dever do Estado e distribui entre os entes federados a tarefa de prover os meios, sem mecanismo capaz de garantir sua chegada à escola. A pergunta, assim, deixa de ser se a PNED está sendo implementada e passa a ser o que acontece com ela quando encontra uma escola, seus profissionais, suas condições materiais e um território específico.</w:t>
       </w:r>
     </w:p>
     <w:p>
@@ -1893,7 +1908,7 @@
           <w:sz w:val="24"/>
           <w:highlight w:val="yellow"/>
         </w:rPr>
-        <w:t>Reconhecemos, contudo, situações próximas registradas pela literatura, das quais a hipótese precisa se diferenciar. Ball, Maguire e Braun (2016) encontraram, nas escolas inglesas estudadas, atuações sustentadas por “uma grande dose de compromisso cru (de alguns diferentes tipos e graus, para estudantes e para as escolas) e muito boa vontade” (BALL; MAGUIRE; BRAUN, 2016, p. 102). Nesses casos, a escola dispunha de meios, em maior ou menor quantidade, e o esforço dos professores completava o que faltava. Em Pipa, o que buscamos compreender é outra coisa: o que acontece quando o esforço precisa começar pela falta e quando a própria exigência de mostrar resultados pode levar a escola a parecer cumprir o que não tem condições de cumprir.</w:t>
+        <w:t>Reconhecemos, contudo, situações próximas registradas pela literatura, das quais esta investigação precisa se diferenciar. Ball, Maguire e Braun (2016) encontraram, nas escolas inglesas estudadas, atuações sustentadas por “uma grande dose de compromisso cru (de alguns diferentes tipos e graus, para estudantes e para as escolas) e muito boa vontade” (BALL; MAGUIRE; BRAUN, 2016, p. 102). Nesses casos, a escola dispunha de meios, em maior ou menor quantidade, e o esforço dos professores completava o que faltava. Em Pipa, o que buscamos compreender é outra coisa: o que acontece quando o esforço precisa começar pela falta e quando a própria exigência de mostrar resultados pode levar a escola a parecer cumprir o que não tem condições de cumprir.</w:t>
       </w:r>
     </w:p>
     <w:p>
@@ -2203,14 +2218,14 @@
           <w:sz w:val="24"/>
           <w:highlight w:val="yellow"/>
         </w:rPr>
-        <w:t>hipótese</w:t>
-      </w:r>
-      <w:r>
-        <w:rPr>
-          <w:rFonts w:ascii="Times New Roman" w:hAnsi="Times New Roman"/>
-          <w:sz w:val="24"/>
-        </w:rPr>
-        <w:t xml:space="preserve"> não opera sozinha na tese. Ela </w:t>
+        <w:t>tese de partida dialoga com duas formulações ligadas às</w:t>
+      </w:r>
+      <w:r>
+        <w:rPr>
+          <w:rFonts w:ascii="Times New Roman" w:hAnsi="Times New Roman"/>
+          <w:sz w:val="24"/>
+        </w:rPr>
+        <w:t xml:space="preserve"> condições documentadas no Capítulo 6</w:t>
       </w:r>
       <w:r>
         <w:rPr>
@@ -2218,22 +2233,7 @@
           <w:sz w:val="24"/>
           <w:highlight w:val="yellow"/>
         </w:rPr>
-        <w:t>se apoia em duas formulações</w:t>
-      </w:r>
-      <w:r>
-        <w:rPr>
-          <w:rFonts w:ascii="Times New Roman" w:hAnsi="Times New Roman"/>
-          <w:sz w:val="24"/>
-        </w:rPr>
-        <w:t xml:space="preserve"> construídas a partir das condições documentadas no Capítulo 6</w:t>
-      </w:r>
-      <w:r>
-        <w:rPr>
-          <w:rFonts w:ascii="Times New Roman" w:hAnsi="Times New Roman"/>
-          <w:sz w:val="24"/>
-          <w:highlight w:val="yellow"/>
-        </w:rPr>
-        <w:t>, o habitar o digital e a rugosidade tecnológica, e na noção de vazio material, construída no Capítulo 5. Habitar o digital é a noção com que procuramos superar a lógica binária que pergunta apenas se a escola tem ou não tem equipamentos. Ela nomeia a experiência, desigual e contraditória, de viver e conviver com a cultura digital num território</w:t>
+        <w:t>, o habitar o digital e a rugosidade tecnológica, e com a noção de vazio material, construída no Capítulo 5. Habitar o digital é mobilizado como possibilidade analítica para ler a educação digital para além do acesso a equipamentos e conectividade, considerando usos, experiências, relações, sentidos e formas de participação. A noção nomeia a experiência, desigual e contraditória, de viver e conviver com a cultura digital num território</w:t>
       </w:r>
       <w:r>
         <w:rPr>
@@ -2330,14 +2330,14 @@
           <w:sz w:val="24"/>
           <w:highlight w:val="yellow"/>
         </w:rPr>
-        <w:t>. A hipótese sobre ressignificação e resistência diz respeito à ação profissional e é</w:t>
-      </w:r>
-      <w:r>
-        <w:rPr>
-          <w:rFonts w:ascii="Times New Roman" w:hAnsi="Times New Roman"/>
-          <w:sz w:val="24"/>
-        </w:rPr>
-        <w:t xml:space="preserve"> a única, de fato, em jogo nas entrevistas. </w:t>
+        <w:t>. As formas de atuação dos profissionais, que podem ir da adesão à resistência, dizem respeito à ação e são o que, de fato, está</w:t>
+      </w:r>
+      <w:r>
+        <w:rPr>
+          <w:rFonts w:ascii="Times New Roman" w:hAnsi="Times New Roman"/>
+          <w:sz w:val="24"/>
+        </w:rPr>
+        <w:t xml:space="preserve"> em jogo nas entrevistas. </w:t>
       </w:r>
       <w:r>
         <w:rPr>
@@ -2367,7 +2367,7 @@
           <w:sz w:val="24"/>
           <w:highlight w:val="yellow"/>
         </w:rPr>
-        <w:t>O objeto também é inédito, e esse ineditismo tem três dimensões. A primeira é empírico-temporal: a pesquisa acompanha a chegada da PNED à escola no momento em que a exigência curricular se torna obrigatória, a partir de 2026, conforme a lacuna identificada pela RSL e descrita na seção 1.2. A segunda é analítico-espacial: o território de Pipa é tomado como força ativa do contexto da prática, e não como pano de fundo. A terceira é teórico-conceitual: em vez de medir a escola pelo acesso aos equipamentos e de explicar a distância entre a norma e a sala de aula como falha de implementação, a tese propõe a noção de habitar o digital e lê essa distância como processo político, no qual os profissionais da educação também produzem política.</w:t>
+        <w:t>O objeto também é inédito, e esse ineditismo tem três dimensões. A primeira é empírico-temporal: a pesquisa acompanha a chegada da PNED à escola no momento em que a exigência curricular se torna obrigatória, a partir de 2026, conforme a lacuna identificada pela RSL e descrita na seção 1.2. A segunda é analítico-espacial: o território de Pipa é tomado como força ativa do contexto da prática, e não como pano de fundo. A terceira é teórico-conceitual: em vez de medir a escola pelo acesso aos equipamentos e de explicar a distância entre a norma e a sala de aula como falha de implementação, a tese mobiliza a noção de habitar o digital e investiga essa distância como processo político, no qual diferentes sujeitos atuam diante de condições específicas, sem tomá-la de antemão como falha, resistência ou inadequação.</w:t>
       </w:r>
     </w:p>
     <w:p>
@@ -2408,7 +2408,22 @@
           <w:rFonts w:ascii="Times New Roman" w:hAnsi="Times New Roman"/>
           <w:sz w:val="24"/>
         </w:rPr>
-        <w:t>A tese está organizada em oito capítulos, articulados à questão norteadora, aos objetivos e à contribuição apresentados nesta introdução. Os Capítulos 5, 6 e 7 respondem, respectivamente, aos objetivos específicos a, b e c; os anteriores constroem as condições para respondê-los. O Quadro 9, no Capítulo 4, detalha a correspondência entre objetivos, fontes e capítulos.</w:t>
+        <w:t xml:space="preserve">A tese está organizada em oito capítulos, articulados à questão norteadora, aos objetivos e à contribuição apresentados nesta introdução. </w:t>
+      </w:r>
+      <w:r>
+        <w:rPr>
+          <w:rFonts w:ascii="Times New Roman" w:hAnsi="Times New Roman"/>
+          <w:sz w:val="24"/>
+          <w:highlight w:val="yellow"/>
+        </w:rPr>
+        <w:t>O Capítulo 7 responde aos quatro objetivos específicos; os Capítulos 5 e 6 constroem as bases</w:t>
+      </w:r>
+      <w:r>
+        <w:rPr>
+          <w:rFonts w:ascii="Times New Roman" w:hAnsi="Times New Roman"/>
+          <w:sz w:val="24"/>
+        </w:rPr>
+        <w:t xml:space="preserve"> para respondê-los. O Quadro 9, no Capítulo 4, detalha a correspondência entre objetivos, fontes e capítulos.</w:t>
       </w:r>
     </w:p>
     <w:p>
@@ -2430,7 +2445,7 @@
           <w:sz w:val="24"/>
           <w:highlight w:val="yellow"/>
         </w:rPr>
-        <w:t>tese que propomos defender</w:t>
+        <w:t>tese de partida</w:t>
       </w:r>
       <w:r>
         <w:rPr>
@@ -2547,7 +2562,7 @@
           <w:sz w:val="24"/>
           <w:highlight w:val="yellow"/>
         </w:rPr>
-        <w:t>definimos, antes das entrevistas, as dimensões do contexto e os movimentos de recontextualização que orientam a análise, com as condições em que a hipótese será sustentada, delimitada ou recusada</w:t>
+        <w:t>definimos, antes das entrevistas, as dimensões do contexto e as formas de atuação que orientam a análise como lentes, e não como molduras fechadas</w:t>
       </w:r>
       <w:r>
         <w:rPr>
@@ -2598,7 +2613,7 @@
           <w:sz w:val="24"/>
           <w:highlight w:val="yellow"/>
         </w:rPr>
-        <w:t>, e identificamos no texto os elementos que podem dar origem a lógicas de performatividade. O capítulo oferece a base para os objetivos específicos a e c, pois, sem saber o que o texto pede, não seria possível compreender em relação a quê os profissionais interpretam, traduzem ou resistem.</w:t>
+        <w:t>, e identificamos no texto os elementos que podem dar origem a lógicas de performatividade. O capítulo oferece a base para os objetivos específicos a, c e d, pois, sem saber o que o texto pede, não seria possível compreender em relação a quê os profissionais interpretam, traduzem ou resistem.</w:t>
       </w:r>
     </w:p>
     <w:p>
@@ -2664,7 +2679,7 @@
           <w:sz w:val="24"/>
           <w:highlight w:val="yellow"/>
         </w:rPr>
-        <w:t>aos três objetivos específicos. Analisamos como os profissionais leem a política, que táticas constroem para traduzi-la e como respondem às pressões por resultados, examinando a hipótese de ressignificação e resistência com as dimensões e</w:t>
+        <w:t>aos quatro objetivos específicos. Analisamos como os profissionais leem a política, como a traduzem nas condições da escola e do território, que formas de atuação produzem diante dela e o que essas formas significam para os direitos das crianças, com as dimensões e</w:t>
       </w:r>
       <w:r>
         <w:rPr>
@@ -2700,74 +2715,7 @@
           <w:sz w:val="24"/>
           <w:highlight w:val="yellow"/>
         </w:rPr>
-        <w:t>A</w:t>
-      </w:r>
-      <w:r>
-        <w:rPr>
-          <w:rFonts w:ascii="Times New Roman" w:hAnsi="Times New Roman"/>
-          <w:sz w:val="24"/>
-        </w:rPr>
-        <w:t xml:space="preserve"> PNED fez da educação digital um direito e </w:t>
-      </w:r>
-      <w:r>
-        <w:rPr>
-          <w:rFonts w:ascii="Times New Roman" w:hAnsi="Times New Roman"/>
-          <w:sz w:val="24"/>
-          <w:highlight w:val="yellow"/>
-        </w:rPr>
-        <w:t>deixou os meios na dependência de cada ente federado</w:t>
-      </w:r>
-      <w:r>
-        <w:rPr>
-          <w:rFonts w:ascii="Times New Roman" w:hAnsi="Times New Roman"/>
-          <w:sz w:val="24"/>
-        </w:rPr>
-        <w:t xml:space="preserve">. As narrativas dos profissionais dirão se, na escola de Pipa, </w:t>
-      </w:r>
-      <w:r>
-        <w:rPr>
-          <w:rFonts w:ascii="Times New Roman" w:hAnsi="Times New Roman"/>
-          <w:sz w:val="24"/>
-          <w:highlight w:val="yellow"/>
-        </w:rPr>
-        <w:t>o território e as culturas profissionais transformaram essa distância em ressignificação ou em resistência, como supomos, ou se a hipótese precisa ser delimitada</w:t>
-      </w:r>
-      <w:r>
-        <w:rPr>
-          <w:rFonts w:ascii="Times New Roman" w:hAnsi="Times New Roman"/>
-          <w:sz w:val="24"/>
-        </w:rPr>
-        <w:t xml:space="preserve"> ou recusada. Em qualquer caso, permanece a pergunta </w:t>
-      </w:r>
-      <w:r>
-        <w:rPr>
-          <w:rFonts w:ascii="Times New Roman" w:hAnsi="Times New Roman"/>
-          <w:sz w:val="24"/>
-          <w:highlight w:val="yellow"/>
-        </w:rPr>
-        <w:t>de fundo: quando a política não faz chegar o equipamento nem a formação, quem paga, no silêncio do cotidiano escolar, o preço dessa ausência? E o que isso significa para os direitos que a lei prometeu às crianças? A pergunta importa porque envolve sujeitos concretos: os</w:t>
-      </w:r>
-      <w:r>
-        <w:rPr>
-          <w:rFonts w:ascii="Times New Roman" w:hAnsi="Times New Roman"/>
-          <w:sz w:val="24"/>
-        </w:rPr>
-        <w:t xml:space="preserve"> profissionais da educação e as crianças </w:t>
-      </w:r>
-      <w:r>
-        <w:rPr>
-          <w:rFonts w:ascii="Times New Roman" w:hAnsi="Times New Roman"/>
-          <w:sz w:val="24"/>
-          <w:highlight w:val="yellow"/>
-        </w:rPr>
-        <w:t>dos anos iniciais</w:t>
-      </w:r>
-      <w:r>
-        <w:rPr>
-          <w:rFonts w:ascii="Times New Roman" w:hAnsi="Times New Roman"/>
-          <w:sz w:val="24"/>
-        </w:rPr>
-        <w:t xml:space="preserve"> de uma escola pública de Pipa.</w:t>
+        <w:t>A PNED fez da educação digital um direito e deixou os meios na dependência de cada ente federado. As narrativas dos profissionais mostrarão que formas a encenação da PNED assume na escola de Pipa, da adesão à resistência, e em que condições elas aparecem. Em qualquer caso, permanece a pergunta de fundo: quando a política não faz chegar o equipamento nem a formação, quem paga, no silêncio do cotidiano escolar, o preço dessa ausência? E o que isso significa para os direitos que a lei prometeu às crianças? A pergunta importa porque envolve sujeitos concretos: os profissionais da educação e as crianças dos anos iniciais de uma escola pública de Pipa.</w:t>
       </w:r>
     </w:p>
     <w:p>

</xml_diff>